<commit_message>
correccion del manual tecnico
</commit_message>
<xml_diff>
--- a/TP2. E10 Manual Tecnico.docx
+++ b/TP2. E10 Manual Tecnico.docx
@@ -1,6 +1,6 @@
 
 <file path=word/document.xml><?xml version="1.0" encoding="utf-8"?>
-<w:document xmlns:wpc="http://schemas.microsoft.com/office/word/2010/wordprocessingCanvas" xmlns:cx="http://schemas.microsoft.com/office/drawing/2014/chartex" xmlns:cx1="http://schemas.microsoft.com/office/drawing/2015/9/8/chartex" xmlns:cx2="http://schemas.microsoft.com/office/drawing/2015/10/21/chartex" xmlns:cx3="http://schemas.microsoft.com/office/drawing/2016/5/9/chartex" xmlns:cx4="http://schemas.microsoft.com/office/drawing/2016/5/10/chartex" xmlns:cx5="http://schemas.microsoft.com/office/drawing/2016/5/11/chartex" xmlns:cx6="http://schemas.microsoft.com/office/drawing/2016/5/12/chartex" xmlns:cx7="http://schemas.microsoft.com/office/drawing/2016/5/13/chartex" xmlns:cx8="http://schemas.microsoft.com/office/drawing/2016/5/14/chartex" xmlns:mc="http://schemas.openxmlformats.org/markup-compatibility/2006" xmlns:aink="http://schemas.microsoft.com/office/drawing/2016/ink" xmlns:am3d="http://schemas.microsoft.com/office/drawing/2017/model3d" xmlns:o="urn:schemas-microsoft-com:office:office" xmlns:r="http://schemas.openxmlformats.org/officeDocument/2006/relationships" xmlns:m="http://schemas.openxmlformats.org/officeDocument/2006/math" xmlns:v="urn:schemas-microsoft-com:vml" xmlns:wp14="http://schemas.microsoft.com/office/word/2010/wordprocessingDrawing" xmlns:wp="http://schemas.openxmlformats.org/drawingml/2006/wordprocessingDrawing" xmlns:w10="urn:schemas-microsoft-com:office:word" xmlns:w="http://schemas.openxmlformats.org/wordprocessingml/2006/main" xmlns:w14="http://schemas.microsoft.com/office/word/2010/wordml" xmlns:w15="http://schemas.microsoft.com/office/word/2012/wordml" xmlns:w16cid="http://schemas.microsoft.com/office/word/2016/wordml/cid" xmlns:w16se="http://schemas.microsoft.com/office/word/2015/wordml/symex" xmlns:wpg="http://schemas.microsoft.com/office/word/2010/wordprocessingGroup" xmlns:wpi="http://schemas.microsoft.com/office/word/2010/wordprocessingInk" xmlns:wne="http://schemas.microsoft.com/office/word/2006/wordml" xmlns:wps="http://schemas.microsoft.com/office/word/2010/wordprocessingShape" mc:Ignorable="w14 w15 w16se w16cid wp14">
+<w:document xmlns:wpc="http://schemas.microsoft.com/office/word/2010/wordprocessingCanvas" xmlns:cx="http://schemas.microsoft.com/office/drawing/2014/chartex" xmlns:cx1="http://schemas.microsoft.com/office/drawing/2015/9/8/chartex" xmlns:cx2="http://schemas.microsoft.com/office/drawing/2015/10/21/chartex" xmlns:cx3="http://schemas.microsoft.com/office/drawing/2016/5/9/chartex" xmlns:cx4="http://schemas.microsoft.com/office/drawing/2016/5/10/chartex" xmlns:cx5="http://schemas.microsoft.com/office/drawing/2016/5/11/chartex" xmlns:cx6="http://schemas.microsoft.com/office/drawing/2016/5/12/chartex" xmlns:cx7="http://schemas.microsoft.com/office/drawing/2016/5/13/chartex" xmlns:cx8="http://schemas.microsoft.com/office/drawing/2016/5/14/chartex" xmlns:mc="http://schemas.openxmlformats.org/markup-compatibility/2006" xmlns:aink="http://schemas.microsoft.com/office/drawing/2016/ink" xmlns:am3d="http://schemas.microsoft.com/office/drawing/2017/model3d" xmlns:o="urn:schemas-microsoft-com:office:office" xmlns:oel="http://schemas.microsoft.com/office/2019/extlst" xmlns:r="http://schemas.openxmlformats.org/officeDocument/2006/relationships" xmlns:m="http://schemas.openxmlformats.org/officeDocument/2006/math" xmlns:v="urn:schemas-microsoft-com:vml" xmlns:wp14="http://schemas.microsoft.com/office/word/2010/wordprocessingDrawing" xmlns:wp="http://schemas.openxmlformats.org/drawingml/2006/wordprocessingDrawing" xmlns:w10="urn:schemas-microsoft-com:office:word" xmlns:w="http://schemas.openxmlformats.org/wordprocessingml/2006/main" xmlns:w14="http://schemas.microsoft.com/office/word/2010/wordml" xmlns:w15="http://schemas.microsoft.com/office/word/2012/wordml" xmlns:w16cex="http://schemas.microsoft.com/office/word/2018/wordml/cex" xmlns:w16cid="http://schemas.microsoft.com/office/word/2016/wordml/cid" xmlns:w16="http://schemas.microsoft.com/office/word/2018/wordml" xmlns:w16du="http://schemas.microsoft.com/office/word/2023/wordml/word16du" xmlns:w16sdtdh="http://schemas.microsoft.com/office/word/2020/wordml/sdtdatahash" xmlns:w16sdtfl="http://schemas.microsoft.com/office/word/2024/wordml/sdtformatlock" xmlns:w16se="http://schemas.microsoft.com/office/word/2015/wordml/symex" xmlns:wpg="http://schemas.microsoft.com/office/word/2010/wordprocessingGroup" xmlns:wpi="http://schemas.microsoft.com/office/word/2010/wordprocessingInk" xmlns:wne="http://schemas.microsoft.com/office/word/2006/wordml" xmlns:wps="http://schemas.microsoft.com/office/word/2010/wordprocessingShape" mc:Ignorable="w14 w15 w16se w16cid w16 w16cex w16sdtdh w16sdtfl w16du wp14">
   <w:body>
     <w:p>
       <w:pPr>
@@ -28,8 +28,6 @@
       <w:r>
         <w:t>Tani</w:t>
       </w:r>
-      <w:bookmarkStart w:id="0" w:name="_GoBack"/>
-      <w:bookmarkEnd w:id="0"/>
       <w:proofErr w:type="spellEnd"/>
     </w:p>
     <w:p>
@@ -125,8 +123,19 @@
       </w:r>
     </w:p>
     <w:p>
-      <w:r>
-        <w:t>Sistema de control y dispensación del Banco de Leche Materna (AYNI) para el Hospital Regional del Cusco. Su objetivo es digitalizar la gestión de histórico clínico, donantes, almacén, pases de visita y la dispensación por toma/hora.</w:t>
+      <w:pPr>
+        <w:ind w:left="708" w:hanging="708"/>
+      </w:pPr>
+      <w:r>
+        <w:t>Sistema de control y dispensación del Banco de Leche Materna (</w:t>
+      </w:r>
+      <w:proofErr w:type="spellStart"/>
+      <w:r>
+        <w:t>Tani</w:t>
+      </w:r>
+      <w:proofErr w:type="spellEnd"/>
+      <w:r>
+        <w:t>) para el Hospital Regional del Cusco. Su objetivo es digitalizar la gestión de histórico clínico, donantes, almacén, pases de visita y la dispensación por toma/hora.</w:t>
       </w:r>
       <w:r>
         <w:t xml:space="preserve"> Según este manual es d</w:t>
@@ -306,28 +315,14 @@
               <w:spacing w:after="160" w:line="259" w:lineRule="auto"/>
               <w:cnfStyle w:val="000000000000" w:firstRow="0" w:lastRow="0" w:firstColumn="0" w:lastColumn="0" w:oddVBand="0" w:evenVBand="0" w:oddHBand="0" w:evenHBand="0" w:firstRowFirstColumn="0" w:firstRowLastColumn="0" w:lastRowFirstColumn="0" w:lastRowLastColumn="0"/>
               <w:rPr>
-                <w:lang w:eastAsia="es-PE"/>
+                <w:lang w:val="en-US" w:eastAsia="es-PE"/>
               </w:rPr>
             </w:pPr>
             <w:r>
               <w:rPr>
-                <w:lang w:eastAsia="es-PE"/>
+                <w:lang w:val="en-US" w:eastAsia="es-PE"/>
               </w:rPr>
-              <w:t xml:space="preserve">Spring </w:t>
-            </w:r>
-            <w:proofErr w:type="spellStart"/>
-            <w:r>
-              <w:rPr>
-                <w:lang w:eastAsia="es-PE"/>
-              </w:rPr>
-              <w:t>Boot</w:t>
-            </w:r>
-            <w:proofErr w:type="spellEnd"/>
-            <w:r>
-              <w:rPr>
-                <w:lang w:eastAsia="es-PE"/>
-              </w:rPr>
-              <w:t xml:space="preserve"> (Java 17), Spring Data JPA, Spring Web, Spring Security</w:t>
+              <w:t>Spring Boot (Java 17), Spring Data JPA, Spring Web, Spring Security</w:t>
             </w:r>
           </w:p>
         </w:tc>
@@ -492,21 +487,7 @@
               <w:rPr>
                 <w:lang w:eastAsia="es-PE"/>
               </w:rPr>
-              <w:t>Git/</w:t>
-            </w:r>
-            <w:proofErr w:type="gramStart"/>
-            <w:r>
-              <w:rPr>
-                <w:lang w:eastAsia="es-PE"/>
-              </w:rPr>
-              <w:t>GitHub(</w:t>
-            </w:r>
-            <w:proofErr w:type="gramEnd"/>
-            <w:r>
-              <w:rPr>
-                <w:lang w:eastAsia="es-PE"/>
-              </w:rPr>
-              <w:t>Repositorio del proyecto), servidor XAMPP(Entorno local).</w:t>
+              <w:t>Git/GitHub(Repositorio del proyecto), servidor XAMPP(Entorno local).</w:t>
             </w:r>
           </w:p>
         </w:tc>
@@ -682,24 +663,24 @@
         <w:spacing w:after="0" w:line="240" w:lineRule="auto"/>
       </w:pPr>
       <w:r>
-        <w:t xml:space="preserve">│   │   ├── </w:t>
-      </w:r>
-      <w:r>
-        <w:t>EnfermedadController</w:t>
-      </w:r>
-      <w:r>
-        <w:t>.js</w:t>
-      </w:r>
-    </w:p>
-    <w:p>
-      <w:pPr>
-        <w:spacing w:after="0" w:line="240" w:lineRule="auto"/>
-      </w:pPr>
-      <w:r>
         <w:lastRenderedPageBreak/>
         <w:t xml:space="preserve">│   │   ├── </w:t>
       </w:r>
       <w:r>
+        <w:t>EnfermedadController</w:t>
+      </w:r>
+      <w:r>
+        <w:t>.js</w:t>
+      </w:r>
+    </w:p>
+    <w:p>
+      <w:pPr>
+        <w:spacing w:after="0" w:line="240" w:lineRule="auto"/>
+      </w:pPr>
+      <w:r>
+        <w:t xml:space="preserve">│   │   ├── </w:t>
+      </w:r>
+      <w:r>
         <w:t>EnfermedadesPacienteController</w:t>
       </w:r>
       <w:r>
@@ -1295,20 +1276,6 @@
       </w:r>
       <w:r>
         <w:t>DonadoraService</w:t>
-      </w:r>
-      <w:r>
-        <w:t>.js</w:t>
-      </w:r>
-    </w:p>
-    <w:p>
-      <w:pPr>
-        <w:spacing w:after="0" w:line="240" w:lineRule="auto"/>
-      </w:pPr>
-      <w:r>
-        <w:t xml:space="preserve">│   │   ├── </w:t>
-      </w:r>
-      <w:r>
-        <w:t>EnfermedadesPacienteService</w:t>
       </w:r>
       <w:r>
         <w:t>.js</w:t>
@@ -1323,6 +1290,20 @@
         <w:t xml:space="preserve">│   │   ├── </w:t>
       </w:r>
       <w:r>
+        <w:t>EnfermedadesPacienteService</w:t>
+      </w:r>
+      <w:r>
+        <w:t>.js</w:t>
+      </w:r>
+    </w:p>
+    <w:p>
+      <w:pPr>
+        <w:spacing w:after="0" w:line="240" w:lineRule="auto"/>
+      </w:pPr>
+      <w:r>
+        <w:t xml:space="preserve">│   │   ├── </w:t>
+      </w:r>
+      <w:r>
         <w:t>EnfermedadService</w:t>
       </w:r>
       <w:r>
@@ -2112,6 +2093,7 @@
         <w:spacing w:after="0" w:line="240" w:lineRule="auto"/>
       </w:pPr>
       <w:r>
+        <w:lastRenderedPageBreak/>
         <w:t>│   │   │   │</w:t>
       </w:r>
       <w:r>
@@ -2135,7 +2117,6 @@
         <w:spacing w:after="0" w:line="240" w:lineRule="auto"/>
       </w:pPr>
       <w:r>
-        <w:lastRenderedPageBreak/>
         <w:t>│   │   │   ├──</w:t>
       </w:r>
       <w:proofErr w:type="spellStart"/>
@@ -2978,6 +2959,7 @@
         <w:spacing w:after="0" w:line="240" w:lineRule="auto"/>
       </w:pPr>
       <w:r>
+        <w:lastRenderedPageBreak/>
         <w:t>│   │   │   │</w:t>
       </w:r>
       <w:r>
@@ -2996,7 +2978,6 @@
         <w:spacing w:after="0" w:line="240" w:lineRule="auto"/>
       </w:pPr>
       <w:r>
-        <w:lastRenderedPageBreak/>
         <w:t>│   │   │   │</w:t>
       </w:r>
       <w:r>
@@ -3830,6 +3811,7 @@
         <w:spacing w:after="0" w:line="240" w:lineRule="auto"/>
       </w:pPr>
       <w:r>
+        <w:lastRenderedPageBreak/>
         <w:t xml:space="preserve">    └── config.js</w:t>
       </w:r>
     </w:p>
@@ -3838,7 +3820,6 @@
         <w:pStyle w:val="Ttulo1"/>
       </w:pPr>
       <w:r>
-        <w:lastRenderedPageBreak/>
         <w:t xml:space="preserve">4. </w:t>
       </w:r>
       <w:r>
@@ -3942,7 +3923,6 @@
         </w:rPr>
       </w:pPr>
       <w:proofErr w:type="spellStart"/>
-      <w:proofErr w:type="gramStart"/>
       <w:r>
         <w:rPr>
           <w:lang w:eastAsia="es-PE"/>
@@ -3950,7 +3930,6 @@
         <w:t>login.component</w:t>
       </w:r>
       <w:proofErr w:type="spellEnd"/>
-      <w:proofErr w:type="gramEnd"/>
       <w:r>
         <w:rPr>
           <w:lang w:eastAsia="es-PE"/>
@@ -3976,7 +3955,6 @@
         <w:t>registro-</w:t>
       </w:r>
       <w:proofErr w:type="spellStart"/>
-      <w:proofErr w:type="gramStart"/>
       <w:r>
         <w:rPr>
           <w:lang w:eastAsia="es-PE"/>
@@ -3984,7 +3962,6 @@
         <w:t>madre.component</w:t>
       </w:r>
       <w:proofErr w:type="spellEnd"/>
-      <w:proofErr w:type="gramEnd"/>
       <w:r>
         <w:rPr>
           <w:lang w:eastAsia="es-PE"/>
@@ -4010,7 +3987,6 @@
         <w:t>pase-de-</w:t>
       </w:r>
       <w:proofErr w:type="spellStart"/>
-      <w:proofErr w:type="gramStart"/>
       <w:r>
         <w:rPr>
           <w:lang w:eastAsia="es-PE"/>
@@ -4018,7 +3994,6 @@
         <w:t>visita.component</w:t>
       </w:r>
       <w:proofErr w:type="spellEnd"/>
-      <w:proofErr w:type="gramEnd"/>
       <w:r>
         <w:rPr>
           <w:lang w:eastAsia="es-PE"/>
@@ -4044,7 +4019,6 @@
         <w:t>registro-</w:t>
       </w:r>
       <w:proofErr w:type="spellStart"/>
-      <w:proofErr w:type="gramStart"/>
       <w:r>
         <w:rPr>
           <w:lang w:eastAsia="es-PE"/>
@@ -4052,7 +4026,6 @@
         <w:t>pasteurizado.component</w:t>
       </w:r>
       <w:proofErr w:type="spellEnd"/>
-      <w:proofErr w:type="gramEnd"/>
       <w:r>
         <w:rPr>
           <w:lang w:eastAsia="es-PE"/>
@@ -4322,70 +4295,42 @@
           <w:numId w:val="38"/>
         </w:numPr>
         <w:rPr>
-          <w:lang w:eastAsia="es-PE"/>
-        </w:rPr>
-      </w:pPr>
-      <w:r>
-        <w:rPr>
-          <w:lang w:eastAsia="es-PE"/>
-        </w:rPr>
-        <w:t>POST /api/</w:t>
+          <w:lang w:val="en-US" w:eastAsia="es-PE"/>
+        </w:rPr>
+      </w:pPr>
+      <w:r>
+        <w:rPr>
+          <w:lang w:val="en-US" w:eastAsia="es-PE"/>
+        </w:rPr>
+        <w:t>POST /</w:t>
       </w:r>
       <w:proofErr w:type="spellStart"/>
       <w:r>
         <w:rPr>
-          <w:lang w:eastAsia="es-PE"/>
-        </w:rPr>
-        <w:t>auth</w:t>
+          <w:lang w:val="en-US" w:eastAsia="es-PE"/>
+        </w:rPr>
+        <w:t>api</w:t>
       </w:r>
       <w:proofErr w:type="spellEnd"/>
       <w:r>
         <w:rPr>
-          <w:lang w:eastAsia="es-PE"/>
-        </w:rPr>
-        <w:t>/</w:t>
+          <w:lang w:val="en-US" w:eastAsia="es-PE"/>
+        </w:rPr>
+        <w:t>/auth/login, POST /</w:t>
       </w:r>
       <w:proofErr w:type="spellStart"/>
       <w:r>
         <w:rPr>
-          <w:lang w:eastAsia="es-PE"/>
-        </w:rPr>
-        <w:t>login</w:t>
+          <w:lang w:val="en-US" w:eastAsia="es-PE"/>
+        </w:rPr>
+        <w:t>api</w:t>
       </w:r>
       <w:proofErr w:type="spellEnd"/>
       <w:r>
         <w:rPr>
-          <w:lang w:eastAsia="es-PE"/>
-        </w:rPr>
-        <w:t>, POST /api/</w:t>
-      </w:r>
-      <w:proofErr w:type="spellStart"/>
-      <w:r>
-        <w:rPr>
-          <w:lang w:eastAsia="es-PE"/>
-        </w:rPr>
-        <w:t>auth</w:t>
-      </w:r>
-      <w:proofErr w:type="spellEnd"/>
-      <w:r>
-        <w:rPr>
-          <w:lang w:eastAsia="es-PE"/>
-        </w:rPr>
-        <w:t>/</w:t>
-      </w:r>
-      <w:proofErr w:type="spellStart"/>
-      <w:r>
-        <w:rPr>
-          <w:lang w:eastAsia="es-PE"/>
-        </w:rPr>
-        <w:t>register</w:t>
-      </w:r>
-      <w:proofErr w:type="spellEnd"/>
-      <w:r>
-        <w:rPr>
-          <w:lang w:eastAsia="es-PE"/>
-        </w:rPr>
-        <w:t>.</w:t>
+          <w:lang w:val="en-US" w:eastAsia="es-PE"/>
+        </w:rPr>
+        <w:t>/auth/register.</w:t>
       </w:r>
     </w:p>
     <w:p>
@@ -4477,6 +4422,7 @@
           <w:bCs/>
           <w:lang w:eastAsia="es-PE"/>
         </w:rPr>
+        <w:lastRenderedPageBreak/>
         <w:t>Motor:</w:t>
       </w:r>
       <w:r>
@@ -4552,7 +4498,6 @@
           <w:bCs/>
           <w:lang w:eastAsia="es-PE"/>
         </w:rPr>
-        <w:lastRenderedPageBreak/>
         <w:t>Esquema:</w:t>
       </w:r>
     </w:p>
@@ -4564,104 +4509,54 @@
           <w:numId w:val="39"/>
         </w:numPr>
         <w:rPr>
-          <w:lang w:val="en-US" w:eastAsia="es-PE"/>
-        </w:rPr>
-      </w:pPr>
+          <w:lang w:eastAsia="es-PE"/>
+        </w:rPr>
+      </w:pPr>
+      <w:r>
+        <w:rPr>
+          <w:lang w:eastAsia="es-PE"/>
+        </w:rPr>
+        <w:t xml:space="preserve">usuario (id, nombre, apellidos, </w:t>
+      </w:r>
       <w:proofErr w:type="spellStart"/>
       <w:r>
         <w:rPr>
-          <w:lang w:val="en-US" w:eastAsia="es-PE"/>
-        </w:rPr>
-        <w:t>usuario</w:t>
+          <w:lang w:eastAsia="es-PE"/>
+        </w:rPr>
+        <w:t>profesion</w:t>
       </w:r>
       <w:proofErr w:type="spellEnd"/>
       <w:r>
         <w:rPr>
-          <w:lang w:val="en-US" w:eastAsia="es-PE"/>
-        </w:rPr>
-        <w:t xml:space="preserve"> (id, </w:t>
+          <w:lang w:eastAsia="es-PE"/>
+        </w:rPr>
+        <w:t xml:space="preserve">, rol, </w:t>
       </w:r>
       <w:proofErr w:type="spellStart"/>
       <w:r>
         <w:rPr>
-          <w:lang w:val="en-US" w:eastAsia="es-PE"/>
-        </w:rPr>
-        <w:t>nombre</w:t>
+          <w:lang w:eastAsia="es-PE"/>
+        </w:rPr>
+        <w:t>nombre_usuario</w:t>
       </w:r>
       <w:proofErr w:type="spellEnd"/>
       <w:r>
         <w:rPr>
-          <w:lang w:val="en-US" w:eastAsia="es-PE"/>
+          <w:lang w:eastAsia="es-PE"/>
         </w:rPr>
         <w:t xml:space="preserve">, </w:t>
       </w:r>
       <w:proofErr w:type="spellStart"/>
       <w:r>
         <w:rPr>
-          <w:lang w:val="en-US" w:eastAsia="es-PE"/>
-        </w:rPr>
-        <w:t>apellidos</w:t>
+          <w:lang w:eastAsia="es-PE"/>
+        </w:rPr>
+        <w:t>contrasena</w:t>
       </w:r>
       <w:proofErr w:type="spellEnd"/>
       <w:r>
         <w:rPr>
-          <w:lang w:val="en-US" w:eastAsia="es-PE"/>
-        </w:rPr>
-        <w:t xml:space="preserve">, </w:t>
-      </w:r>
-      <w:proofErr w:type="spellStart"/>
-      <w:r>
-        <w:rPr>
-          <w:lang w:val="en-US" w:eastAsia="es-PE"/>
-        </w:rPr>
-        <w:t>profesion</w:t>
-      </w:r>
-      <w:proofErr w:type="spellEnd"/>
-      <w:r>
-        <w:rPr>
-          <w:lang w:val="en-US" w:eastAsia="es-PE"/>
-        </w:rPr>
-        <w:t xml:space="preserve">, </w:t>
-      </w:r>
-      <w:proofErr w:type="spellStart"/>
-      <w:r>
-        <w:rPr>
-          <w:lang w:val="en-US" w:eastAsia="es-PE"/>
-        </w:rPr>
-        <w:t>rol</w:t>
-      </w:r>
-      <w:proofErr w:type="spellEnd"/>
-      <w:r>
-        <w:rPr>
-          <w:lang w:val="en-US" w:eastAsia="es-PE"/>
-        </w:rPr>
-        <w:t xml:space="preserve">, </w:t>
-      </w:r>
-      <w:proofErr w:type="spellStart"/>
-      <w:r>
-        <w:rPr>
-          <w:lang w:val="en-US" w:eastAsia="es-PE"/>
-        </w:rPr>
-        <w:t>nombre_usuario</w:t>
-      </w:r>
-      <w:proofErr w:type="spellEnd"/>
-      <w:r>
-        <w:rPr>
-          <w:lang w:val="en-US" w:eastAsia="es-PE"/>
-        </w:rPr>
-        <w:t xml:space="preserve">, </w:t>
-      </w:r>
-      <w:proofErr w:type="spellStart"/>
-      <w:r>
-        <w:rPr>
-          <w:lang w:val="en-US" w:eastAsia="es-PE"/>
-        </w:rPr>
-        <w:t>contrasena</w:t>
-      </w:r>
-      <w:proofErr w:type="spellEnd"/>
-      <w:r>
-        <w:rPr>
-          <w:lang w:val="en-US" w:eastAsia="es-PE"/>
+          <w:lang w:eastAsia="es-PE"/>
         </w:rPr>
         <w:t xml:space="preserve">). </w:t>
       </w:r>
@@ -4674,132 +4569,96 @@
           <w:numId w:val="39"/>
         </w:numPr>
         <w:rPr>
-          <w:lang w:val="en-US" w:eastAsia="es-PE"/>
-        </w:rPr>
-      </w:pPr>
+          <w:lang w:eastAsia="es-PE"/>
+        </w:rPr>
+      </w:pPr>
+      <w:r>
+        <w:rPr>
+          <w:lang w:eastAsia="es-PE"/>
+        </w:rPr>
+        <w:t>paciente (</w:t>
+      </w:r>
       <w:proofErr w:type="spellStart"/>
       <w:r>
         <w:rPr>
-          <w:lang w:val="en-US" w:eastAsia="es-PE"/>
-        </w:rPr>
-        <w:t>paciente</w:t>
+          <w:lang w:eastAsia="es-PE"/>
+        </w:rPr>
+        <w:t>paciente_id</w:t>
       </w:r>
       <w:proofErr w:type="spellEnd"/>
       <w:r>
         <w:rPr>
-          <w:lang w:val="en-US" w:eastAsia="es-PE"/>
-        </w:rPr>
-        <w:t xml:space="preserve"> (</w:t>
+          <w:lang w:eastAsia="es-PE"/>
+        </w:rPr>
+        <w:t xml:space="preserve">, nombre, apellidos, </w:t>
       </w:r>
       <w:proofErr w:type="spellStart"/>
       <w:r>
         <w:rPr>
-          <w:lang w:val="en-US" w:eastAsia="es-PE"/>
-        </w:rPr>
-        <w:t>paciente_id</w:t>
+          <w:lang w:eastAsia="es-PE"/>
+        </w:rPr>
+        <w:t>fecha_nacimiento</w:t>
       </w:r>
       <w:proofErr w:type="spellEnd"/>
       <w:r>
         <w:rPr>
-          <w:lang w:val="en-US" w:eastAsia="es-PE"/>
+          <w:lang w:eastAsia="es-PE"/>
         </w:rPr>
         <w:t xml:space="preserve">, </w:t>
       </w:r>
       <w:proofErr w:type="spellStart"/>
       <w:r>
         <w:rPr>
-          <w:lang w:val="en-US" w:eastAsia="es-PE"/>
-        </w:rPr>
-        <w:t>nombre</w:t>
+          <w:lang w:eastAsia="es-PE"/>
+        </w:rPr>
+        <w:t>peso_nacimiento</w:t>
       </w:r>
       <w:proofErr w:type="spellEnd"/>
       <w:r>
         <w:rPr>
-          <w:lang w:val="en-US" w:eastAsia="es-PE"/>
+          <w:lang w:eastAsia="es-PE"/>
         </w:rPr>
         <w:t xml:space="preserve">, </w:t>
       </w:r>
       <w:proofErr w:type="spellStart"/>
       <w:r>
         <w:rPr>
-          <w:lang w:val="en-US" w:eastAsia="es-PE"/>
-        </w:rPr>
-        <w:t>apellidos</w:t>
+          <w:lang w:eastAsia="es-PE"/>
+        </w:rPr>
+        <w:t>edad_gestacional</w:t>
       </w:r>
       <w:proofErr w:type="spellEnd"/>
       <w:r>
         <w:rPr>
-          <w:lang w:val="en-US" w:eastAsia="es-PE"/>
+          <w:lang w:eastAsia="es-PE"/>
         </w:rPr>
         <w:t xml:space="preserve">, </w:t>
       </w:r>
       <w:proofErr w:type="spellStart"/>
       <w:r>
         <w:rPr>
-          <w:lang w:val="en-US" w:eastAsia="es-PE"/>
-        </w:rPr>
-        <w:t>fecha_nacimiento</w:t>
+          <w:lang w:eastAsia="es-PE"/>
+        </w:rPr>
+        <w:t>cuna_id</w:t>
       </w:r>
       <w:proofErr w:type="spellEnd"/>
       <w:r>
         <w:rPr>
-          <w:lang w:val="en-US" w:eastAsia="es-PE"/>
+          <w:lang w:eastAsia="es-PE"/>
         </w:rPr>
         <w:t xml:space="preserve">, </w:t>
       </w:r>
       <w:proofErr w:type="spellStart"/>
       <w:r>
         <w:rPr>
-          <w:lang w:val="en-US" w:eastAsia="es-PE"/>
-        </w:rPr>
-        <w:t>peso_nacimiento</w:t>
+          <w:lang w:eastAsia="es-PE"/>
+        </w:rPr>
+        <w:t>dni_madre</w:t>
       </w:r>
       <w:proofErr w:type="spellEnd"/>
       <w:r>
         <w:rPr>
-          <w:lang w:val="en-US" w:eastAsia="es-PE"/>
-        </w:rPr>
-        <w:t xml:space="preserve">, </w:t>
-      </w:r>
-      <w:proofErr w:type="spellStart"/>
-      <w:r>
-        <w:rPr>
-          <w:lang w:val="en-US" w:eastAsia="es-PE"/>
-        </w:rPr>
-        <w:t>edad_gestacional</w:t>
-      </w:r>
-      <w:proofErr w:type="spellEnd"/>
-      <w:r>
-        <w:rPr>
-          <w:lang w:val="en-US" w:eastAsia="es-PE"/>
-        </w:rPr>
-        <w:t xml:space="preserve">, </w:t>
-      </w:r>
-      <w:proofErr w:type="spellStart"/>
-      <w:r>
-        <w:rPr>
-          <w:lang w:val="en-US" w:eastAsia="es-PE"/>
-        </w:rPr>
-        <w:t>cuna_id</w:t>
-      </w:r>
-      <w:proofErr w:type="spellEnd"/>
-      <w:r>
-        <w:rPr>
-          <w:lang w:val="en-US" w:eastAsia="es-PE"/>
-        </w:rPr>
-        <w:t xml:space="preserve">, </w:t>
-      </w:r>
-      <w:proofErr w:type="spellStart"/>
-      <w:r>
-        <w:rPr>
-          <w:lang w:val="en-US" w:eastAsia="es-PE"/>
-        </w:rPr>
-        <w:t>dni_madre</w:t>
-      </w:r>
-      <w:proofErr w:type="spellEnd"/>
-      <w:r>
-        <w:rPr>
-          <w:lang w:val="en-US" w:eastAsia="es-PE"/>
+          <w:lang w:eastAsia="es-PE"/>
         </w:rPr>
         <w:t xml:space="preserve">). </w:t>
       </w:r>
@@ -4812,110 +4671,96 @@
           <w:numId w:val="39"/>
         </w:numPr>
         <w:rPr>
-          <w:lang w:val="en-US" w:eastAsia="es-PE"/>
-        </w:rPr>
-      </w:pPr>
-      <w:r>
-        <w:rPr>
-          <w:lang w:val="en-US" w:eastAsia="es-PE"/>
+          <w:lang w:eastAsia="es-PE"/>
+        </w:rPr>
+      </w:pPr>
+      <w:r>
+        <w:rPr>
+          <w:lang w:eastAsia="es-PE"/>
         </w:rPr>
         <w:t xml:space="preserve">leche / </w:t>
       </w:r>
       <w:proofErr w:type="spellStart"/>
       <w:r>
         <w:rPr>
-          <w:lang w:val="en-US" w:eastAsia="es-PE"/>
+          <w:lang w:eastAsia="es-PE"/>
         </w:rPr>
         <w:t>almacen</w:t>
       </w:r>
       <w:proofErr w:type="spellEnd"/>
       <w:r>
         <w:rPr>
-          <w:lang w:val="en-US" w:eastAsia="es-PE"/>
+          <w:lang w:eastAsia="es-PE"/>
         </w:rPr>
         <w:t xml:space="preserve"> (</w:t>
       </w:r>
       <w:proofErr w:type="spellStart"/>
       <w:r>
         <w:rPr>
-          <w:lang w:val="en-US" w:eastAsia="es-PE"/>
+          <w:lang w:eastAsia="es-PE"/>
         </w:rPr>
         <w:t>codigo_leche</w:t>
       </w:r>
       <w:proofErr w:type="spellEnd"/>
       <w:r>
         <w:rPr>
-          <w:lang w:val="en-US" w:eastAsia="es-PE"/>
+          <w:lang w:eastAsia="es-PE"/>
+        </w:rPr>
+        <w:t xml:space="preserve">, tipo, kcal, </w:t>
+      </w:r>
+      <w:proofErr w:type="spellStart"/>
+      <w:r>
+        <w:rPr>
+          <w:lang w:eastAsia="es-PE"/>
+        </w:rPr>
+        <w:t>porcentaje_grasa</w:t>
+      </w:r>
+      <w:proofErr w:type="spellEnd"/>
+      <w:r>
+        <w:rPr>
+          <w:lang w:eastAsia="es-PE"/>
         </w:rPr>
         <w:t xml:space="preserve">, </w:t>
       </w:r>
       <w:proofErr w:type="spellStart"/>
       <w:r>
         <w:rPr>
-          <w:lang w:val="en-US" w:eastAsia="es-PE"/>
-        </w:rPr>
-        <w:t>tipo</w:t>
+          <w:lang w:eastAsia="es-PE"/>
+        </w:rPr>
+        <w:t>cantidad_ml</w:t>
       </w:r>
       <w:proofErr w:type="spellEnd"/>
       <w:r>
         <w:rPr>
-          <w:lang w:val="en-US" w:eastAsia="es-PE"/>
-        </w:rPr>
-        <w:t xml:space="preserve">, kcal, </w:t>
+          <w:lang w:eastAsia="es-PE"/>
+        </w:rPr>
+        <w:t xml:space="preserve">, </w:t>
       </w:r>
       <w:proofErr w:type="spellStart"/>
       <w:r>
         <w:rPr>
-          <w:lang w:val="en-US" w:eastAsia="es-PE"/>
-        </w:rPr>
-        <w:t>porcentaje_grasa</w:t>
+          <w:lang w:eastAsia="es-PE"/>
+        </w:rPr>
+        <w:t>fecha_ingreso</w:t>
       </w:r>
       <w:proofErr w:type="spellEnd"/>
       <w:r>
         <w:rPr>
-          <w:lang w:val="en-US" w:eastAsia="es-PE"/>
+          <w:lang w:eastAsia="es-PE"/>
         </w:rPr>
         <w:t xml:space="preserve">, </w:t>
       </w:r>
       <w:proofErr w:type="spellStart"/>
       <w:r>
         <w:rPr>
-          <w:lang w:val="en-US" w:eastAsia="es-PE"/>
-        </w:rPr>
-        <w:t>cantidad_ml</w:t>
+          <w:lang w:eastAsia="es-PE"/>
+        </w:rPr>
+        <w:t>fecha_vencimiento</w:t>
       </w:r>
       <w:proofErr w:type="spellEnd"/>
       <w:r>
         <w:rPr>
-          <w:lang w:val="en-US" w:eastAsia="es-PE"/>
-        </w:rPr>
-        <w:t xml:space="preserve">, </w:t>
-      </w:r>
-      <w:proofErr w:type="spellStart"/>
-      <w:r>
-        <w:rPr>
-          <w:lang w:val="en-US" w:eastAsia="es-PE"/>
-        </w:rPr>
-        <w:t>fecha_ingreso</w:t>
-      </w:r>
-      <w:proofErr w:type="spellEnd"/>
-      <w:r>
-        <w:rPr>
-          <w:lang w:val="en-US" w:eastAsia="es-PE"/>
-        </w:rPr>
-        <w:t xml:space="preserve">, </w:t>
-      </w:r>
-      <w:proofErr w:type="spellStart"/>
-      <w:r>
-        <w:rPr>
-          <w:lang w:val="en-US" w:eastAsia="es-PE"/>
-        </w:rPr>
-        <w:t>fecha_vencimiento</w:t>
-      </w:r>
-      <w:proofErr w:type="spellEnd"/>
-      <w:r>
-        <w:rPr>
-          <w:lang w:val="en-US" w:eastAsia="es-PE"/>
+          <w:lang w:eastAsia="es-PE"/>
         </w:rPr>
         <w:t>).</w:t>
       </w:r>
@@ -5239,31 +5084,74 @@
           <w:rFonts w:ascii="Consolas" w:hAnsi="Consolas"/>
           <w:lang w:eastAsia="es-PE"/>
         </w:rPr>
-        <w:t>spring-</w:t>
-      </w:r>
-      <w:proofErr w:type="gramStart"/>
-      <w:r>
+        <w:t>spring-boot:run</w:t>
+      </w:r>
+      <w:proofErr w:type="spellEnd"/>
+    </w:p>
+    <w:p>
+      <w:pPr>
+        <w:pStyle w:val="Ttulo2"/>
+      </w:pPr>
+      <w:r>
+        <w:t xml:space="preserve">6.3 </w:t>
+      </w:r>
+      <w:proofErr w:type="spellStart"/>
+      <w:r>
+        <w:t>Frontend</w:t>
+      </w:r>
+      <w:proofErr w:type="spellEnd"/>
+    </w:p>
+    <w:p>
+      <w:pPr>
+        <w:spacing w:after="0" w:line="240" w:lineRule="auto"/>
+        <w:ind w:left="567"/>
         <w:rPr>
           <w:rFonts w:ascii="Consolas" w:hAnsi="Consolas"/>
           <w:lang w:eastAsia="es-PE"/>
         </w:rPr>
-        <w:t>boot:run</w:t>
+      </w:pPr>
+      <w:r>
+        <w:rPr>
+          <w:rFonts w:ascii="Consolas" w:hAnsi="Consolas"/>
+          <w:lang w:eastAsia="es-PE"/>
+        </w:rPr>
+        <w:t xml:space="preserve">cd </w:t>
+      </w:r>
+      <w:proofErr w:type="spellStart"/>
+      <w:r>
+        <w:rPr>
+          <w:rFonts w:ascii="Consolas" w:hAnsi="Consolas"/>
+          <w:lang w:eastAsia="es-PE"/>
+        </w:rPr>
+        <w:t>frontend</w:t>
       </w:r>
       <w:proofErr w:type="spellEnd"/>
-      <w:proofErr w:type="gramEnd"/>
-    </w:p>
-    <w:p>
-      <w:pPr>
-        <w:pStyle w:val="Ttulo2"/>
-      </w:pPr>
-      <w:r>
-        <w:t xml:space="preserve">6.3 </w:t>
-      </w:r>
+    </w:p>
+    <w:p>
+      <w:pPr>
+        <w:spacing w:after="0" w:line="240" w:lineRule="auto"/>
+        <w:ind w:left="567"/>
+        <w:rPr>
+          <w:rFonts w:ascii="Consolas" w:hAnsi="Consolas"/>
+          <w:lang w:val="en-US" w:eastAsia="es-PE"/>
+        </w:rPr>
+      </w:pPr>
       <w:proofErr w:type="spellStart"/>
       <w:r>
-        <w:t>Frontend</w:t>
+        <w:rPr>
+          <w:rFonts w:ascii="Consolas" w:hAnsi="Consolas"/>
+          <w:lang w:val="en-US" w:eastAsia="es-PE"/>
+        </w:rPr>
+        <w:t>npm</w:t>
       </w:r>
       <w:proofErr w:type="spellEnd"/>
+      <w:r>
+        <w:rPr>
+          <w:rFonts w:ascii="Consolas" w:hAnsi="Consolas"/>
+          <w:lang w:val="en-US" w:eastAsia="es-PE"/>
+        </w:rPr>
+        <w:t xml:space="preserve"> install -g @angular/cli@19.0.0</w:t>
+      </w:r>
     </w:p>
     <w:p>
       <w:pPr>
@@ -5271,25 +5159,42 @@
         <w:ind w:left="567"/>
         <w:rPr>
           <w:rFonts w:ascii="Consolas" w:hAnsi="Consolas"/>
-          <w:lang w:eastAsia="es-PE"/>
+          <w:lang w:val="en-US" w:eastAsia="es-PE"/>
         </w:rPr>
       </w:pPr>
       <w:r>
         <w:rPr>
           <w:rFonts w:ascii="Consolas" w:hAnsi="Consolas"/>
-          <w:lang w:eastAsia="es-PE"/>
-        </w:rPr>
-        <w:t xml:space="preserve">cd </w:t>
-      </w:r>
+          <w:lang w:val="en-US" w:eastAsia="es-PE"/>
+        </w:rPr>
+        <w:t>ng --version</w:t>
+      </w:r>
+    </w:p>
+    <w:p>
+      <w:pPr>
+        <w:spacing w:after="0" w:line="240" w:lineRule="auto"/>
+        <w:ind w:left="567"/>
+        <w:rPr>
+          <w:rFonts w:ascii="Consolas" w:hAnsi="Consolas"/>
+          <w:lang w:val="en-US" w:eastAsia="es-PE"/>
+        </w:rPr>
+      </w:pPr>
       <w:proofErr w:type="spellStart"/>
       <w:r>
         <w:rPr>
           <w:rFonts w:ascii="Consolas" w:hAnsi="Consolas"/>
-          <w:lang w:eastAsia="es-PE"/>
-        </w:rPr>
-        <w:t>frontend</w:t>
+          <w:lang w:val="en-US" w:eastAsia="es-PE"/>
+        </w:rPr>
+        <w:t>npm</w:t>
       </w:r>
       <w:proofErr w:type="spellEnd"/>
+      <w:r>
+        <w:rPr>
+          <w:rFonts w:ascii="Consolas" w:hAnsi="Consolas"/>
+          <w:lang w:val="en-US" w:eastAsia="es-PE"/>
+        </w:rPr>
+        <w:t xml:space="preserve"> install</w:t>
+      </w:r>
     </w:p>
     <w:p>
       <w:pPr>
@@ -5297,14 +5202,14 @@
         <w:ind w:left="567"/>
         <w:rPr>
           <w:rFonts w:ascii="Consolas" w:hAnsi="Consolas"/>
-          <w:lang w:eastAsia="es-PE"/>
+          <w:lang w:val="en-US" w:eastAsia="es-PE"/>
         </w:rPr>
       </w:pPr>
       <w:proofErr w:type="spellStart"/>
       <w:r>
         <w:rPr>
           <w:rFonts w:ascii="Consolas" w:hAnsi="Consolas"/>
-          <w:lang w:eastAsia="es-PE"/>
+          <w:lang w:val="en-US" w:eastAsia="es-PE"/>
         </w:rPr>
         <w:t>npm</w:t>
       </w:r>
@@ -5312,154 +5217,42 @@
       <w:r>
         <w:rPr>
           <w:rFonts w:ascii="Consolas" w:hAnsi="Consolas"/>
-          <w:lang w:eastAsia="es-PE"/>
-        </w:rPr>
-        <w:t xml:space="preserve"> </w:t>
-      </w:r>
-      <w:proofErr w:type="spellStart"/>
-      <w:r>
+          <w:lang w:val="en-US" w:eastAsia="es-PE"/>
+        </w:rPr>
+        <w:t xml:space="preserve"> start</w:t>
+      </w:r>
+    </w:p>
+    <w:p>
+      <w:pPr>
+        <w:spacing w:after="0" w:line="240" w:lineRule="auto"/>
+        <w:ind w:left="567"/>
+        <w:rPr>
+          <w:lang w:eastAsia="es-PE"/>
+        </w:rPr>
+      </w:pPr>
+      <w:r>
+        <w:rPr>
+          <w:lang w:eastAsia="es-PE"/>
+        </w:rPr>
+        <w:t>Chart.js</w:t>
+      </w:r>
+    </w:p>
+    <w:p>
+      <w:pPr>
+        <w:spacing w:after="0" w:line="240" w:lineRule="auto"/>
+        <w:ind w:left="567"/>
         <w:rPr>
           <w:rFonts w:ascii="Consolas" w:hAnsi="Consolas"/>
           <w:lang w:eastAsia="es-PE"/>
         </w:rPr>
-        <w:t>install</w:t>
-      </w:r>
-      <w:proofErr w:type="spellEnd"/>
+      </w:pPr>
       <w:r>
         <w:rPr>
           <w:rFonts w:ascii="Consolas" w:hAnsi="Consolas"/>
           <w:lang w:eastAsia="es-PE"/>
         </w:rPr>
-        <w:t xml:space="preserve"> -g @angular/cli@19.0.0</w:t>
-      </w:r>
-    </w:p>
-    <w:p>
-      <w:pPr>
-        <w:spacing w:after="0" w:line="240" w:lineRule="auto"/>
-        <w:ind w:left="567"/>
-        <w:rPr>
-          <w:rFonts w:ascii="Consolas" w:hAnsi="Consolas"/>
-          <w:lang w:eastAsia="es-PE"/>
-        </w:rPr>
-      </w:pPr>
-      <w:r>
-        <w:rPr>
-          <w:rFonts w:ascii="Consolas" w:hAnsi="Consolas"/>
-          <w:lang w:eastAsia="es-PE"/>
-        </w:rPr>
-        <w:t>ng --</w:t>
-      </w:r>
-      <w:proofErr w:type="spellStart"/>
-      <w:r>
-        <w:rPr>
-          <w:rFonts w:ascii="Consolas" w:hAnsi="Consolas"/>
-          <w:lang w:eastAsia="es-PE"/>
-        </w:rPr>
-        <w:t>version</w:t>
-      </w:r>
-      <w:proofErr w:type="spellEnd"/>
-    </w:p>
-    <w:p>
-      <w:pPr>
-        <w:spacing w:after="0" w:line="240" w:lineRule="auto"/>
-        <w:ind w:left="567"/>
-        <w:rPr>
-          <w:rFonts w:ascii="Consolas" w:hAnsi="Consolas"/>
-          <w:lang w:eastAsia="es-PE"/>
-        </w:rPr>
-      </w:pPr>
-      <w:proofErr w:type="spellStart"/>
-      <w:r>
-        <w:rPr>
-          <w:rFonts w:ascii="Consolas" w:hAnsi="Consolas"/>
-          <w:lang w:eastAsia="es-PE"/>
-        </w:rPr>
-        <w:t>npm</w:t>
-      </w:r>
-      <w:proofErr w:type="spellEnd"/>
-      <w:r>
-        <w:rPr>
-          <w:rFonts w:ascii="Consolas" w:hAnsi="Consolas"/>
-          <w:lang w:eastAsia="es-PE"/>
-        </w:rPr>
-        <w:t xml:space="preserve"> </w:t>
-      </w:r>
-      <w:proofErr w:type="spellStart"/>
-      <w:r>
-        <w:rPr>
-          <w:rFonts w:ascii="Consolas" w:hAnsi="Consolas"/>
-          <w:lang w:eastAsia="es-PE"/>
-        </w:rPr>
-        <w:t>install</w:t>
-      </w:r>
-      <w:proofErr w:type="spellEnd"/>
-    </w:p>
-    <w:p>
-      <w:pPr>
-        <w:spacing w:after="0" w:line="240" w:lineRule="auto"/>
-        <w:ind w:left="567"/>
-        <w:rPr>
-          <w:rFonts w:ascii="Consolas" w:hAnsi="Consolas"/>
-          <w:lang w:eastAsia="es-PE"/>
-        </w:rPr>
-      </w:pPr>
-      <w:proofErr w:type="spellStart"/>
-      <w:r>
-        <w:rPr>
-          <w:rFonts w:ascii="Consolas" w:hAnsi="Consolas"/>
-          <w:lang w:eastAsia="es-PE"/>
-        </w:rPr>
-        <w:t>npm</w:t>
-      </w:r>
-      <w:proofErr w:type="spellEnd"/>
-      <w:r>
-        <w:rPr>
-          <w:rFonts w:ascii="Consolas" w:hAnsi="Consolas"/>
-          <w:lang w:eastAsia="es-PE"/>
-        </w:rPr>
-        <w:t xml:space="preserve"> start</w:t>
-      </w:r>
-    </w:p>
-    <w:p>
-      <w:pPr>
-        <w:spacing w:after="0" w:line="240" w:lineRule="auto"/>
-        <w:ind w:left="567"/>
-        <w:rPr>
-          <w:lang w:eastAsia="es-PE"/>
-        </w:rPr>
-      </w:pPr>
-      <w:r>
-        <w:rPr>
-          <w:lang w:eastAsia="es-PE"/>
-        </w:rPr>
-        <w:t>Chart.js</w:t>
-      </w:r>
-    </w:p>
-    <w:p>
-      <w:pPr>
-        <w:spacing w:after="0" w:line="240" w:lineRule="auto"/>
-        <w:ind w:left="567"/>
-        <w:rPr>
-          <w:rFonts w:ascii="Consolas" w:hAnsi="Consolas"/>
-          <w:lang w:eastAsia="es-PE"/>
-        </w:rPr>
-      </w:pPr>
-      <w:r>
-        <w:rPr>
-          <w:rFonts w:ascii="Consolas" w:hAnsi="Consolas"/>
-          <w:lang w:eastAsia="es-PE"/>
-        </w:rPr>
-        <w:t xml:space="preserve">Ng </w:t>
-      </w:r>
-      <w:proofErr w:type="spellStart"/>
-      <w:r>
-        <w:rPr>
-          <w:rFonts w:ascii="Consolas" w:hAnsi="Consolas"/>
-          <w:lang w:eastAsia="es-PE"/>
-        </w:rPr>
-        <w:t>serve</w:t>
-      </w:r>
-      <w:proofErr w:type="spellEnd"/>
+        <w:t>Ng serve</w:t>
+      </w:r>
     </w:p>
     <w:p>
       <w:pPr>
@@ -5578,14 +5371,8 @@
         <w:rPr>
           <w:lang w:eastAsia="es-PE"/>
         </w:rPr>
-        <w:t xml:space="preserve">Configurar credenciales </w:t>
-      </w:r>
-      <w:proofErr w:type="gramStart"/>
-      <w:r>
-        <w:rPr>
-          <w:lang w:eastAsia="es-PE"/>
-        </w:rPr>
-        <w:t>en .</w:t>
+        <w:lastRenderedPageBreak/>
+        <w:t>Configurar credenciales en .</w:t>
       </w:r>
       <w:proofErr w:type="spellStart"/>
       <w:r>
@@ -5595,14 +5382,12 @@
         <w:t>env</w:t>
       </w:r>
       <w:proofErr w:type="spellEnd"/>
-      <w:proofErr w:type="gramEnd"/>
     </w:p>
     <w:p>
       <w:pPr>
         <w:pStyle w:val="Ttulo1"/>
       </w:pPr>
       <w:r>
-        <w:lastRenderedPageBreak/>
         <w:t>7. Seguridad</w:t>
       </w:r>
     </w:p>
@@ -5882,6 +5667,69 @@
           <w:lang w:eastAsia="es-PE"/>
         </w:rPr>
         <w:t>Equipo de trabajo:</w:t>
+      </w:r>
+      <w:r>
+        <w:rPr>
+          <w:lang w:eastAsia="es-PE"/>
+        </w:rPr>
+        <w:t xml:space="preserve">                                                         N* de contacto</w:t>
+      </w:r>
+    </w:p>
+    <w:p>
+      <w:pPr>
+        <w:rPr>
+          <w:lang w:eastAsia="es-PE"/>
+        </w:rPr>
+      </w:pPr>
+      <w:r>
+        <w:rPr>
+          <w:lang w:eastAsia="es-PE"/>
+        </w:rPr>
+        <w:t>APAZA ROJAS TANIA ISABEL</w:t>
+      </w:r>
+      <w:r>
+        <w:rPr>
+          <w:lang w:eastAsia="es-PE"/>
+        </w:rPr>
+        <w:t xml:space="preserve">                               913253332 </w:t>
+      </w:r>
+    </w:p>
+    <w:p>
+      <w:pPr>
+        <w:rPr>
+          <w:lang w:eastAsia="es-PE"/>
+        </w:rPr>
+      </w:pPr>
+      <w:r>
+        <w:rPr>
+          <w:lang w:eastAsia="es-PE"/>
+        </w:rPr>
+        <w:t>LECHUGA MICHE DIEGO RICARDO</w:t>
+      </w:r>
+      <w:r>
+        <w:rPr>
+          <w:lang w:eastAsia="es-PE"/>
+        </w:rPr>
+        <w:t xml:space="preserve">                     958769859</w:t>
+      </w:r>
+    </w:p>
+    <w:p>
+      <w:pPr>
+        <w:rPr>
+          <w:lang w:eastAsia="es-PE"/>
+        </w:rPr>
+      </w:pPr>
+      <w:r>
+        <w:rPr>
+          <w:lang w:eastAsia="es-PE"/>
+        </w:rPr>
+        <w:t xml:space="preserve">PANIHUARA ALVAREZ AARON GIOVANNY </w:t>
+      </w:r>
+      <w:r>
+        <w:rPr>
+          <w:lang w:eastAsia="es-PE"/>
+        </w:rPr>
+        <w:t xml:space="preserve">    901333451</w:t>
       </w:r>
     </w:p>
     <w:p>
@@ -5916,7 +5764,7 @@
 </file>
 
 <file path=word/numbering.xml><?xml version="1.0" encoding="utf-8"?>
-<w:numbering xmlns:wpc="http://schemas.microsoft.com/office/word/2010/wordprocessingCanvas" xmlns:cx="http://schemas.microsoft.com/office/drawing/2014/chartex" xmlns:cx1="http://schemas.microsoft.com/office/drawing/2015/9/8/chartex" xmlns:cx2="http://schemas.microsoft.com/office/drawing/2015/10/21/chartex" xmlns:cx3="http://schemas.microsoft.com/office/drawing/2016/5/9/chartex" xmlns:cx4="http://schemas.microsoft.com/office/drawing/2016/5/10/chartex" xmlns:cx5="http://schemas.microsoft.com/office/drawing/2016/5/11/chartex" xmlns:cx6="http://schemas.microsoft.com/office/drawing/2016/5/12/chartex" xmlns:cx7="http://schemas.microsoft.com/office/drawing/2016/5/13/chartex" xmlns:cx8="http://schemas.microsoft.com/office/drawing/2016/5/14/chartex" xmlns:mc="http://schemas.openxmlformats.org/markup-compatibility/2006" xmlns:aink="http://schemas.microsoft.com/office/drawing/2016/ink" xmlns:am3d="http://schemas.microsoft.com/office/drawing/2017/model3d" xmlns:o="urn:schemas-microsoft-com:office:office" xmlns:r="http://schemas.openxmlformats.org/officeDocument/2006/relationships" xmlns:m="http://schemas.openxmlformats.org/officeDocument/2006/math" xmlns:v="urn:schemas-microsoft-com:vml" xmlns:wp14="http://schemas.microsoft.com/office/word/2010/wordprocessingDrawing" xmlns:wp="http://schemas.openxmlformats.org/drawingml/2006/wordprocessingDrawing" xmlns:w10="urn:schemas-microsoft-com:office:word" xmlns:w="http://schemas.openxmlformats.org/wordprocessingml/2006/main" xmlns:w14="http://schemas.microsoft.com/office/word/2010/wordml" xmlns:w15="http://schemas.microsoft.com/office/word/2012/wordml" xmlns:w16cid="http://schemas.microsoft.com/office/word/2016/wordml/cid" xmlns:w16se="http://schemas.microsoft.com/office/word/2015/wordml/symex" xmlns:wpg="http://schemas.microsoft.com/office/word/2010/wordprocessingGroup" xmlns:wpi="http://schemas.microsoft.com/office/word/2010/wordprocessingInk" xmlns:wne="http://schemas.microsoft.com/office/word/2006/wordml" xmlns:wps="http://schemas.microsoft.com/office/word/2010/wordprocessingShape" mc:Ignorable="w14 w15 w16se w16cid wp14">
+<w:numbering xmlns:wpc="http://schemas.microsoft.com/office/word/2010/wordprocessingCanvas" xmlns:cx="http://schemas.microsoft.com/office/drawing/2014/chartex" xmlns:cx1="http://schemas.microsoft.com/office/drawing/2015/9/8/chartex" xmlns:cx2="http://schemas.microsoft.com/office/drawing/2015/10/21/chartex" xmlns:cx3="http://schemas.microsoft.com/office/drawing/2016/5/9/chartex" xmlns:cx4="http://schemas.microsoft.com/office/drawing/2016/5/10/chartex" xmlns:cx5="http://schemas.microsoft.com/office/drawing/2016/5/11/chartex" xmlns:cx6="http://schemas.microsoft.com/office/drawing/2016/5/12/chartex" xmlns:cx7="http://schemas.microsoft.com/office/drawing/2016/5/13/chartex" xmlns:cx8="http://schemas.microsoft.com/office/drawing/2016/5/14/chartex" xmlns:mc="http://schemas.openxmlformats.org/markup-compatibility/2006" xmlns:aink="http://schemas.microsoft.com/office/drawing/2016/ink" xmlns:am3d="http://schemas.microsoft.com/office/drawing/2017/model3d" xmlns:o="urn:schemas-microsoft-com:office:office" xmlns:oel="http://schemas.microsoft.com/office/2019/extlst" xmlns:r="http://schemas.openxmlformats.org/officeDocument/2006/relationships" xmlns:m="http://schemas.openxmlformats.org/officeDocument/2006/math" xmlns:v="urn:schemas-microsoft-com:vml" xmlns:wp14="http://schemas.microsoft.com/office/word/2010/wordprocessingDrawing" xmlns:wp="http://schemas.openxmlformats.org/drawingml/2006/wordprocessingDrawing" xmlns:w10="urn:schemas-microsoft-com:office:word" xmlns:w="http://schemas.openxmlformats.org/wordprocessingml/2006/main" xmlns:w14="http://schemas.microsoft.com/office/word/2010/wordml" xmlns:w15="http://schemas.microsoft.com/office/word/2012/wordml" xmlns:w16cex="http://schemas.microsoft.com/office/word/2018/wordml/cex" xmlns:w16cid="http://schemas.microsoft.com/office/word/2016/wordml/cid" xmlns:w16="http://schemas.microsoft.com/office/word/2018/wordml" xmlns:w16du="http://schemas.microsoft.com/office/word/2023/wordml/word16du" xmlns:w16sdtdh="http://schemas.microsoft.com/office/word/2020/wordml/sdtdatahash" xmlns:w16sdtfl="http://schemas.microsoft.com/office/word/2024/wordml/sdtformatlock" xmlns:w16se="http://schemas.microsoft.com/office/word/2015/wordml/symex" xmlns:wpg="http://schemas.microsoft.com/office/word/2010/wordprocessingGroup" xmlns:wpi="http://schemas.microsoft.com/office/word/2010/wordprocessingInk" xmlns:wne="http://schemas.microsoft.com/office/word/2006/wordml" xmlns:wps="http://schemas.microsoft.com/office/word/2010/wordprocessingShape" mc:Ignorable="w14 w15 w16se w16cid w16 w16cex w16sdtdh w16sdtfl w16du wp14">
   <w:abstractNum w:abstractNumId="0" w15:restartNumberingAfterBreak="0">
     <w:nsid w:val="03B035B2"/>
     <w:multiLevelType w:val="multilevel"/>
@@ -11935,146 +11783,146 @@
       </w:pPr>
     </w:lvl>
   </w:abstractNum>
-  <w:num w:numId="1">
+  <w:num w:numId="1" w16cid:durableId="515460793">
     <w:abstractNumId w:val="41"/>
   </w:num>
-  <w:num w:numId="2">
+  <w:num w:numId="2" w16cid:durableId="307829627">
     <w:abstractNumId w:val="40"/>
   </w:num>
-  <w:num w:numId="3">
+  <w:num w:numId="3" w16cid:durableId="412895151">
     <w:abstractNumId w:val="15"/>
   </w:num>
-  <w:num w:numId="4">
+  <w:num w:numId="4" w16cid:durableId="887496330">
     <w:abstractNumId w:val="13"/>
   </w:num>
-  <w:num w:numId="5">
+  <w:num w:numId="5" w16cid:durableId="843939710">
     <w:abstractNumId w:val="39"/>
   </w:num>
-  <w:num w:numId="6">
+  <w:num w:numId="6" w16cid:durableId="1496846726">
     <w:abstractNumId w:val="38"/>
   </w:num>
-  <w:num w:numId="7">
+  <w:num w:numId="7" w16cid:durableId="1476214068">
     <w:abstractNumId w:val="1"/>
   </w:num>
-  <w:num w:numId="8">
+  <w:num w:numId="8" w16cid:durableId="1376857373">
     <w:abstractNumId w:val="8"/>
   </w:num>
-  <w:num w:numId="9">
+  <w:num w:numId="9" w16cid:durableId="1556550323">
     <w:abstractNumId w:val="7"/>
   </w:num>
-  <w:num w:numId="10">
+  <w:num w:numId="10" w16cid:durableId="738092639">
     <w:abstractNumId w:val="17"/>
   </w:num>
-  <w:num w:numId="11">
+  <w:num w:numId="11" w16cid:durableId="1112819732">
     <w:abstractNumId w:val="9"/>
   </w:num>
-  <w:num w:numId="12">
+  <w:num w:numId="12" w16cid:durableId="635110276">
     <w:abstractNumId w:val="14"/>
   </w:num>
-  <w:num w:numId="13">
+  <w:num w:numId="13" w16cid:durableId="1474324137">
     <w:abstractNumId w:val="21"/>
   </w:num>
-  <w:num w:numId="14">
+  <w:num w:numId="14" w16cid:durableId="78792749">
     <w:abstractNumId w:val="18"/>
   </w:num>
-  <w:num w:numId="15">
+  <w:num w:numId="15" w16cid:durableId="705299143">
     <w:abstractNumId w:val="12"/>
   </w:num>
-  <w:num w:numId="16">
+  <w:num w:numId="16" w16cid:durableId="325744409">
     <w:abstractNumId w:val="36"/>
   </w:num>
-  <w:num w:numId="17">
+  <w:num w:numId="17" w16cid:durableId="2024476073">
     <w:abstractNumId w:val="26"/>
   </w:num>
-  <w:num w:numId="18">
+  <w:num w:numId="18" w16cid:durableId="1732344051">
     <w:abstractNumId w:val="25"/>
   </w:num>
-  <w:num w:numId="19">
+  <w:num w:numId="19" w16cid:durableId="109671524">
     <w:abstractNumId w:val="10"/>
   </w:num>
-  <w:num w:numId="20">
+  <w:num w:numId="20" w16cid:durableId="761531117">
     <w:abstractNumId w:val="34"/>
   </w:num>
-  <w:num w:numId="21">
+  <w:num w:numId="21" w16cid:durableId="318508389">
     <w:abstractNumId w:val="33"/>
   </w:num>
-  <w:num w:numId="22">
+  <w:num w:numId="22" w16cid:durableId="453183843">
     <w:abstractNumId w:val="5"/>
   </w:num>
-  <w:num w:numId="23">
+  <w:num w:numId="23" w16cid:durableId="21784920">
     <w:abstractNumId w:val="44"/>
   </w:num>
-  <w:num w:numId="24">
+  <w:num w:numId="24" w16cid:durableId="986125593">
     <w:abstractNumId w:val="11"/>
   </w:num>
-  <w:num w:numId="25">
+  <w:num w:numId="25" w16cid:durableId="1858420426">
     <w:abstractNumId w:val="19"/>
   </w:num>
-  <w:num w:numId="26">
+  <w:num w:numId="26" w16cid:durableId="572006287">
     <w:abstractNumId w:val="37"/>
   </w:num>
-  <w:num w:numId="27">
+  <w:num w:numId="27" w16cid:durableId="718817968">
     <w:abstractNumId w:val="35"/>
   </w:num>
-  <w:num w:numId="28">
+  <w:num w:numId="28" w16cid:durableId="496186570">
     <w:abstractNumId w:val="4"/>
   </w:num>
-  <w:num w:numId="29">
+  <w:num w:numId="29" w16cid:durableId="240024245">
     <w:abstractNumId w:val="23"/>
   </w:num>
-  <w:num w:numId="30">
+  <w:num w:numId="30" w16cid:durableId="1230116510">
     <w:abstractNumId w:val="2"/>
   </w:num>
-  <w:num w:numId="31">
+  <w:num w:numId="31" w16cid:durableId="108815041">
     <w:abstractNumId w:val="24"/>
   </w:num>
-  <w:num w:numId="32">
+  <w:num w:numId="32" w16cid:durableId="560597824">
     <w:abstractNumId w:val="22"/>
   </w:num>
-  <w:num w:numId="33">
+  <w:num w:numId="33" w16cid:durableId="1786774976">
     <w:abstractNumId w:val="43"/>
   </w:num>
-  <w:num w:numId="34">
+  <w:num w:numId="34" w16cid:durableId="558438953">
     <w:abstractNumId w:val="20"/>
   </w:num>
-  <w:num w:numId="35">
+  <w:num w:numId="35" w16cid:durableId="679360085">
     <w:abstractNumId w:val="28"/>
   </w:num>
-  <w:num w:numId="36">
+  <w:num w:numId="36" w16cid:durableId="1374186901">
     <w:abstractNumId w:val="0"/>
   </w:num>
-  <w:num w:numId="37">
+  <w:num w:numId="37" w16cid:durableId="1178812002">
     <w:abstractNumId w:val="42"/>
   </w:num>
-  <w:num w:numId="38">
+  <w:num w:numId="38" w16cid:durableId="518472809">
     <w:abstractNumId w:val="27"/>
   </w:num>
-  <w:num w:numId="39">
+  <w:num w:numId="39" w16cid:durableId="1910576691">
     <w:abstractNumId w:val="32"/>
   </w:num>
-  <w:num w:numId="40">
+  <w:num w:numId="40" w16cid:durableId="1294487335">
     <w:abstractNumId w:val="16"/>
   </w:num>
-  <w:num w:numId="41">
+  <w:num w:numId="41" w16cid:durableId="706805930">
     <w:abstractNumId w:val="29"/>
   </w:num>
-  <w:num w:numId="42">
+  <w:num w:numId="42" w16cid:durableId="1276327162">
     <w:abstractNumId w:val="30"/>
   </w:num>
-  <w:num w:numId="43">
+  <w:num w:numId="43" w16cid:durableId="639573316">
     <w:abstractNumId w:val="3"/>
   </w:num>
-  <w:num w:numId="44">
+  <w:num w:numId="44" w16cid:durableId="1088774494">
     <w:abstractNumId w:val="31"/>
   </w:num>
-  <w:num w:numId="45">
+  <w:num w:numId="45" w16cid:durableId="1133016930">
     <w:abstractNumId w:val="6"/>
   </w:num>
 </w:numbering>
 </file>
 
 <file path=word/styles.xml><?xml version="1.0" encoding="utf-8"?>
-<w:styles xmlns:mc="http://schemas.openxmlformats.org/markup-compatibility/2006" xmlns:r="http://schemas.openxmlformats.org/officeDocument/2006/relationships" xmlns:w="http://schemas.openxmlformats.org/wordprocessingml/2006/main" xmlns:w14="http://schemas.microsoft.com/office/word/2010/wordml" xmlns:w15="http://schemas.microsoft.com/office/word/2012/wordml" xmlns:w16cid="http://schemas.microsoft.com/office/word/2016/wordml/cid" xmlns:w16se="http://schemas.microsoft.com/office/word/2015/wordml/symex" mc:Ignorable="w14 w15 w16se w16cid">
+<w:styles xmlns:mc="http://schemas.openxmlformats.org/markup-compatibility/2006" xmlns:r="http://schemas.openxmlformats.org/officeDocument/2006/relationships" xmlns:w="http://schemas.openxmlformats.org/wordprocessingml/2006/main" xmlns:w14="http://schemas.microsoft.com/office/word/2010/wordml" xmlns:w15="http://schemas.microsoft.com/office/word/2012/wordml" xmlns:w16cex="http://schemas.microsoft.com/office/word/2018/wordml/cex" xmlns:w16cid="http://schemas.microsoft.com/office/word/2016/wordml/cid" xmlns:w16="http://schemas.microsoft.com/office/word/2018/wordml" xmlns:w16du="http://schemas.microsoft.com/office/word/2023/wordml/word16du" xmlns:w16sdtdh="http://schemas.microsoft.com/office/word/2020/wordml/sdtdatahash" xmlns:w16sdtfl="http://schemas.microsoft.com/office/word/2024/wordml/sdtformatlock" xmlns:w16se="http://schemas.microsoft.com/office/word/2015/wordml/symex" mc:Ignorable="w14 w15 w16se w16cid w16 w16cex w16sdtdh w16sdtfl w16du">
   <w:docDefaults>
     <w:rPrDefault>
       <w:rPr>
@@ -12090,7 +11938,7 @@
       </w:pPr>
     </w:pPrDefault>
   </w:docDefaults>
-  <w:latentStyles w:defLockedState="0" w:defUIPriority="99" w:defSemiHidden="0" w:defUnhideWhenUsed="0" w:defQFormat="0" w:count="375">
+  <w:latentStyles w:defLockedState="0" w:defUIPriority="99" w:defSemiHidden="0" w:defUnhideWhenUsed="0" w:defQFormat="0" w:count="376">
     <w:lsdException w:name="Normal" w:uiPriority="0" w:qFormat="1"/>
     <w:lsdException w:name="heading 1" w:uiPriority="9" w:qFormat="1"/>
     <w:lsdException w:name="heading 2" w:semiHidden="1" w:uiPriority="9" w:unhideWhenUsed="1" w:qFormat="1"/>
@@ -12466,6 +12314,7 @@
     <w:lsdException w:name="Smart Hyperlink" w:semiHidden="1" w:unhideWhenUsed="1"/>
     <w:lsdException w:name="Hashtag" w:semiHidden="1" w:unhideWhenUsed="1"/>
     <w:lsdException w:name="Unresolved Mention" w:semiHidden="1" w:unhideWhenUsed="1"/>
+    <w:lsdException w:name="Smart Link" w:semiHidden="1" w:unhideWhenUsed="1"/>
   </w:latentStyles>
   <w:style w:type="paragraph" w:default="1" w:styleId="Normal">
     <w:name w:val="Normal"/>
@@ -12570,7 +12419,6 @@
   <w:style w:type="character" w:default="1" w:styleId="Fuentedeprrafopredeter">
     <w:name w:val="Default Paragraph Font"/>
     <w:uiPriority w:val="1"/>
-    <w:semiHidden/>
     <w:unhideWhenUsed/>
   </w:style>
   <w:style w:type="table" w:default="1" w:styleId="Tablanormal">

</xml_diff>